<commit_message>
Added a new element to Config.xml : MQTTReconnectAutomatically This will ensure that if the broker is disconnected or not available at startup, the app will try every 5s to reconnect to broker.
</commit_message>
<xml_diff>
--- a/FXP20KeyInjector-HowTo.docx
+++ b/FXP20KeyInjector-HowTo.docx
@@ -1232,19 +1232,7 @@
                   <w:rPr>
                     <w:lang w:val="en-US"/>
                   </w:rPr>
-                  <w:t xml:space="preserve"> </w:t>
-                </w:r>
-                <w:r>
-                  <w:rPr>
-                    <w:lang w:val="en-US"/>
-                  </w:rPr>
-                  <w:t>October</w:t>
-                </w:r>
-                <w:r>
-                  <w:rPr>
-                    <w:lang w:val="en-US"/>
-                  </w:rPr>
-                  <w:t xml:space="preserve"> 2025</w:t>
+                  <w:t xml:space="preserve"> October 2025</w:t>
                 </w:r>
               </w:p>
             </w:tc>
@@ -1280,13 +1268,7 @@
                   <w:rPr>
                     <w:lang w:val="en-US"/>
                   </w:rPr>
-                  <w:t>1.</w:t>
-                </w:r>
-                <w:r>
-                  <w:rPr>
-                    <w:lang w:val="en-US"/>
-                  </w:rPr>
-                  <w:t>7</w:t>
+                  <w:t>1.7</w:t>
                 </w:r>
               </w:p>
             </w:tc>
@@ -1318,7 +1300,33 @@
                   <w:rPr>
                     <w:lang w:val="en-US"/>
                   </w:rPr>
-                  <w:t xml:space="preserve"> description in Config.xml</w:t>
+                  <w:t xml:space="preserve"> </w:t>
+                </w:r>
+                <w:r>
+                  <w:rPr>
+                    <w:lang w:val="en-US"/>
+                  </w:rPr>
+                  <w:t xml:space="preserve">and </w:t>
+                </w:r>
+                <w:proofErr w:type="spellStart"/>
+                <w:r>
+                  <w:rPr>
+                    <w:lang w:val="en-US"/>
+                  </w:rPr>
+                  <w:t>MQTTReconnectAutomatically</w:t>
+                </w:r>
+                <w:proofErr w:type="spellEnd"/>
+                <w:r>
+                  <w:rPr>
+                    <w:lang w:val="en-US"/>
+                  </w:rPr>
+                  <w:t xml:space="preserve"> </w:t>
+                </w:r>
+                <w:r>
+                  <w:rPr>
+                    <w:lang w:val="en-US"/>
+                  </w:rPr>
+                  <w:t>description in Config.xml</w:t>
                 </w:r>
               </w:p>
             </w:tc>
@@ -1382,7 +1390,7 @@
           <w:r>
             <w:fldChar w:fldCharType="separate"/>
           </w:r>
-          <w:hyperlink w:anchor="_Toc208305599" w:history="1">
+          <w:hyperlink w:anchor="_Toc212641139" w:history="1">
             <w:r>
               <w:rPr>
                 <w:rStyle w:val="Hyperlink"/>
@@ -1428,7 +1436,7 @@
                 <w:noProof/>
                 <w:webHidden/>
               </w:rPr>
-              <w:instrText xml:space="preserve"> PAGEREF _Toc208305599 \h </w:instrText>
+              <w:instrText xml:space="preserve"> PAGEREF _Toc212641139 \h </w:instrText>
             </w:r>
             <w:r>
               <w:rPr>
@@ -1476,7 +1484,7 @@
               <w14:ligatures w14:val="standardContextual"/>
             </w:rPr>
           </w:pPr>
-          <w:hyperlink w:anchor="_Toc208305600" w:history="1">
+          <w:hyperlink w:anchor="_Toc212641140" w:history="1">
             <w:r>
               <w:rPr>
                 <w:rStyle w:val="Hyperlink"/>
@@ -1522,7 +1530,7 @@
                 <w:noProof/>
                 <w:webHidden/>
               </w:rPr>
-              <w:instrText xml:space="preserve"> PAGEREF _Toc208305600 \h </w:instrText>
+              <w:instrText xml:space="preserve"> PAGEREF _Toc212641140 \h </w:instrText>
             </w:r>
             <w:r>
               <w:rPr>
@@ -1570,7 +1578,7 @@
               <w14:ligatures w14:val="standardContextual"/>
             </w:rPr>
           </w:pPr>
-          <w:hyperlink w:anchor="_Toc208305601" w:history="1">
+          <w:hyperlink w:anchor="_Toc212641141" w:history="1">
             <w:r>
               <w:rPr>
                 <w:rStyle w:val="Hyperlink"/>
@@ -1616,7 +1624,7 @@
                 <w:noProof/>
                 <w:webHidden/>
               </w:rPr>
-              <w:instrText xml:space="preserve"> PAGEREF _Toc208305601 \h </w:instrText>
+              <w:instrText xml:space="preserve"> PAGEREF _Toc212641141 \h </w:instrText>
             </w:r>
             <w:r>
               <w:rPr>
@@ -1664,7 +1672,7 @@
               <w14:ligatures w14:val="standardContextual"/>
             </w:rPr>
           </w:pPr>
-          <w:hyperlink w:anchor="_Toc208305602" w:history="1">
+          <w:hyperlink w:anchor="_Toc212641142" w:history="1">
             <w:r>
               <w:rPr>
                 <w:rStyle w:val="Hyperlink"/>
@@ -1710,7 +1718,7 @@
                 <w:noProof/>
                 <w:webHidden/>
               </w:rPr>
-              <w:instrText xml:space="preserve"> PAGEREF _Toc208305602 \h </w:instrText>
+              <w:instrText xml:space="preserve"> PAGEREF _Toc212641142 \h </w:instrText>
             </w:r>
             <w:r>
               <w:rPr>
@@ -1758,7 +1766,7 @@
               <w14:ligatures w14:val="standardContextual"/>
             </w:rPr>
           </w:pPr>
-          <w:hyperlink w:anchor="_Toc208305603" w:history="1">
+          <w:hyperlink w:anchor="_Toc212641143" w:history="1">
             <w:r>
               <w:rPr>
                 <w:rStyle w:val="Hyperlink"/>
@@ -1804,7 +1812,7 @@
                 <w:noProof/>
                 <w:webHidden/>
               </w:rPr>
-              <w:instrText xml:space="preserve"> PAGEREF _Toc208305603 \h </w:instrText>
+              <w:instrText xml:space="preserve"> PAGEREF _Toc212641143 \h </w:instrText>
             </w:r>
             <w:r>
               <w:rPr>
@@ -1852,7 +1860,7 @@
               <w14:ligatures w14:val="standardContextual"/>
             </w:rPr>
           </w:pPr>
-          <w:hyperlink w:anchor="_Toc208305604" w:history="1">
+          <w:hyperlink w:anchor="_Toc212641144" w:history="1">
             <w:r>
               <w:rPr>
                 <w:rStyle w:val="Hyperlink"/>
@@ -1898,7 +1906,7 @@
                 <w:noProof/>
                 <w:webHidden/>
               </w:rPr>
-              <w:instrText xml:space="preserve"> PAGEREF _Toc208305604 \h </w:instrText>
+              <w:instrText xml:space="preserve"> PAGEREF _Toc212641144 \h </w:instrText>
             </w:r>
             <w:r>
               <w:rPr>
@@ -1946,7 +1954,7 @@
               <w14:ligatures w14:val="standardContextual"/>
             </w:rPr>
           </w:pPr>
-          <w:hyperlink w:anchor="_Toc208305605" w:history="1">
+          <w:hyperlink w:anchor="_Toc212641145" w:history="1">
             <w:r>
               <w:rPr>
                 <w:rStyle w:val="Hyperlink"/>
@@ -1992,7 +2000,7 @@
                 <w:noProof/>
                 <w:webHidden/>
               </w:rPr>
-              <w:instrText xml:space="preserve"> PAGEREF _Toc208305605 \h </w:instrText>
+              <w:instrText xml:space="preserve"> PAGEREF _Toc212641145 \h </w:instrText>
             </w:r>
             <w:r>
               <w:rPr>
@@ -2040,7 +2048,7 @@
               <w14:ligatures w14:val="standardContextual"/>
             </w:rPr>
           </w:pPr>
-          <w:hyperlink w:anchor="_Toc208305606" w:history="1">
+          <w:hyperlink w:anchor="_Toc212641146" w:history="1">
             <w:r>
               <w:rPr>
                 <w:rStyle w:val="Hyperlink"/>
@@ -2086,7 +2094,7 @@
                 <w:noProof/>
                 <w:webHidden/>
               </w:rPr>
-              <w:instrText xml:space="preserve"> PAGEREF _Toc208305606 \h </w:instrText>
+              <w:instrText xml:space="preserve"> PAGEREF _Toc212641146 \h </w:instrText>
             </w:r>
             <w:r>
               <w:rPr>
@@ -2134,7 +2142,7 @@
               <w14:ligatures w14:val="standardContextual"/>
             </w:rPr>
           </w:pPr>
-          <w:hyperlink w:anchor="_Toc208305607" w:history="1">
+          <w:hyperlink w:anchor="_Toc212641147" w:history="1">
             <w:r>
               <w:rPr>
                 <w:rStyle w:val="Hyperlink"/>
@@ -2180,7 +2188,7 @@
                 <w:noProof/>
                 <w:webHidden/>
               </w:rPr>
-              <w:instrText xml:space="preserve"> PAGEREF _Toc208305607 \h </w:instrText>
+              <w:instrText xml:space="preserve"> PAGEREF _Toc212641147 \h </w:instrText>
             </w:r>
             <w:r>
               <w:rPr>
@@ -2228,7 +2236,7 @@
               <w14:ligatures w14:val="standardContextual"/>
             </w:rPr>
           </w:pPr>
-          <w:hyperlink w:anchor="_Toc208305608" w:history="1">
+          <w:hyperlink w:anchor="_Toc212641148" w:history="1">
             <w:r>
               <w:rPr>
                 <w:rStyle w:val="Hyperlink"/>
@@ -2274,7 +2282,7 @@
                 <w:noProof/>
                 <w:webHidden/>
               </w:rPr>
-              <w:instrText xml:space="preserve"> PAGEREF _Toc208305608 \h </w:instrText>
+              <w:instrText xml:space="preserve"> PAGEREF _Toc212641148 \h </w:instrText>
             </w:r>
             <w:r>
               <w:rPr>
@@ -2322,7 +2330,7 @@
               <w14:ligatures w14:val="standardContextual"/>
             </w:rPr>
           </w:pPr>
-          <w:hyperlink w:anchor="_Toc208305609" w:history="1">
+          <w:hyperlink w:anchor="_Toc212641149" w:history="1">
             <w:r>
               <w:rPr>
                 <w:rStyle w:val="Hyperlink"/>
@@ -2368,7 +2376,7 @@
                 <w:noProof/>
                 <w:webHidden/>
               </w:rPr>
-              <w:instrText xml:space="preserve"> PAGEREF _Toc208305609 \h </w:instrText>
+              <w:instrText xml:space="preserve"> PAGEREF _Toc212641149 \h </w:instrText>
             </w:r>
             <w:r>
               <w:rPr>
@@ -2416,7 +2424,7 @@
               <w14:ligatures w14:val="standardContextual"/>
             </w:rPr>
           </w:pPr>
-          <w:hyperlink w:anchor="_Toc208305610" w:history="1">
+          <w:hyperlink w:anchor="_Toc212641150" w:history="1">
             <w:r>
               <w:rPr>
                 <w:rStyle w:val="Hyperlink"/>
@@ -2462,7 +2470,7 @@
                 <w:noProof/>
                 <w:webHidden/>
               </w:rPr>
-              <w:instrText xml:space="preserve"> PAGEREF _Toc208305610 \h </w:instrText>
+              <w:instrText xml:space="preserve"> PAGEREF _Toc212641150 \h </w:instrText>
             </w:r>
             <w:r>
               <w:rPr>
@@ -2510,7 +2518,7 @@
               <w14:ligatures w14:val="standardContextual"/>
             </w:rPr>
           </w:pPr>
-          <w:hyperlink w:anchor="_Toc208305611" w:history="1">
+          <w:hyperlink w:anchor="_Toc212641151" w:history="1">
             <w:r>
               <w:rPr>
                 <w:rStyle w:val="Hyperlink"/>
@@ -2556,7 +2564,7 @@
                 <w:noProof/>
                 <w:webHidden/>
               </w:rPr>
-              <w:instrText xml:space="preserve"> PAGEREF _Toc208305611 \h </w:instrText>
+              <w:instrText xml:space="preserve"> PAGEREF _Toc212641151 \h </w:instrText>
             </w:r>
             <w:r>
               <w:rPr>
@@ -2604,7 +2612,7 @@
               <w14:ligatures w14:val="standardContextual"/>
             </w:rPr>
           </w:pPr>
-          <w:hyperlink w:anchor="_Toc208305612" w:history="1">
+          <w:hyperlink w:anchor="_Toc212641152" w:history="1">
             <w:r>
               <w:rPr>
                 <w:rStyle w:val="Hyperlink"/>
@@ -2650,7 +2658,7 @@
                 <w:noProof/>
                 <w:webHidden/>
               </w:rPr>
-              <w:instrText xml:space="preserve"> PAGEREF _Toc208305612 \h </w:instrText>
+              <w:instrText xml:space="preserve"> PAGEREF _Toc212641152 \h </w:instrText>
             </w:r>
             <w:r>
               <w:rPr>
@@ -2698,7 +2706,7 @@
               <w14:ligatures w14:val="standardContextual"/>
             </w:rPr>
           </w:pPr>
-          <w:hyperlink w:anchor="_Toc208305613" w:history="1">
+          <w:hyperlink w:anchor="_Toc212641153" w:history="1">
             <w:r>
               <w:rPr>
                 <w:rStyle w:val="Hyperlink"/>
@@ -2744,7 +2752,7 @@
                 <w:noProof/>
                 <w:webHidden/>
               </w:rPr>
-              <w:instrText xml:space="preserve"> PAGEREF _Toc208305613 \h </w:instrText>
+              <w:instrText xml:space="preserve"> PAGEREF _Toc212641153 \h </w:instrText>
             </w:r>
             <w:r>
               <w:rPr>
@@ -2792,7 +2800,7 @@
               <w14:ligatures w14:val="standardContextual"/>
             </w:rPr>
           </w:pPr>
-          <w:hyperlink w:anchor="_Toc208305614" w:history="1">
+          <w:hyperlink w:anchor="_Toc212641154" w:history="1">
             <w:r>
               <w:rPr>
                 <w:rStyle w:val="Hyperlink"/>
@@ -2838,7 +2846,7 @@
                 <w:noProof/>
                 <w:webHidden/>
               </w:rPr>
-              <w:instrText xml:space="preserve"> PAGEREF _Toc208305614 \h </w:instrText>
+              <w:instrText xml:space="preserve"> PAGEREF _Toc212641154 \h </w:instrText>
             </w:r>
             <w:r>
               <w:rPr>
@@ -2886,7 +2894,7 @@
               <w14:ligatures w14:val="standardContextual"/>
             </w:rPr>
           </w:pPr>
-          <w:hyperlink w:anchor="_Toc208305615" w:history="1">
+          <w:hyperlink w:anchor="_Toc212641155" w:history="1">
             <w:r>
               <w:rPr>
                 <w:rStyle w:val="Hyperlink"/>
@@ -2932,7 +2940,7 @@
                 <w:noProof/>
                 <w:webHidden/>
               </w:rPr>
-              <w:instrText xml:space="preserve"> PAGEREF _Toc208305615 \h </w:instrText>
+              <w:instrText xml:space="preserve"> PAGEREF _Toc212641155 \h </w:instrText>
             </w:r>
             <w:r>
               <w:rPr>
@@ -2980,7 +2988,7 @@
               <w14:ligatures w14:val="standardContextual"/>
             </w:rPr>
           </w:pPr>
-          <w:hyperlink w:anchor="_Toc208305616" w:history="1">
+          <w:hyperlink w:anchor="_Toc212641156" w:history="1">
             <w:r>
               <w:rPr>
                 <w:rStyle w:val="Hyperlink"/>
@@ -3026,7 +3034,7 @@
                 <w:noProof/>
                 <w:webHidden/>
               </w:rPr>
-              <w:instrText xml:space="preserve"> PAGEREF _Toc208305616 \h </w:instrText>
+              <w:instrText xml:space="preserve"> PAGEREF _Toc212641156 \h </w:instrText>
             </w:r>
             <w:r>
               <w:rPr>
@@ -3074,7 +3082,7 @@
               <w14:ligatures w14:val="standardContextual"/>
             </w:rPr>
           </w:pPr>
-          <w:hyperlink w:anchor="_Toc208305617" w:history="1">
+          <w:hyperlink w:anchor="_Toc212641157" w:history="1">
             <w:r>
               <w:rPr>
                 <w:rStyle w:val="Hyperlink"/>
@@ -3099,21 +3107,7 @@
                 <w:rStyle w:val="Hyperlink"/>
                 <w:noProof/>
               </w:rPr>
-              <w:t>Config.xm</w:t>
-            </w:r>
-            <w:r>
-              <w:rPr>
-                <w:rStyle w:val="Hyperlink"/>
-                <w:noProof/>
-              </w:rPr>
-              <w:t>l</w:t>
-            </w:r>
-            <w:r>
-              <w:rPr>
-                <w:rStyle w:val="Hyperlink"/>
-                <w:noProof/>
-              </w:rPr>
-              <w:t xml:space="preserve"> file</w:t>
+              <w:t>Config.xml file</w:t>
             </w:r>
             <w:r>
               <w:rPr>
@@ -3134,7 +3128,7 @@
                 <w:noProof/>
                 <w:webHidden/>
               </w:rPr>
-              <w:instrText xml:space="preserve"> PAGEREF _Toc208305617 \h </w:instrText>
+              <w:instrText xml:space="preserve"> PAGEREF _Toc212641157 \h </w:instrText>
             </w:r>
             <w:r>
               <w:rPr>
@@ -3182,7 +3176,7 @@
               <w14:ligatures w14:val="standardContextual"/>
             </w:rPr>
           </w:pPr>
-          <w:hyperlink w:anchor="_Toc208305618" w:history="1">
+          <w:hyperlink w:anchor="_Toc212641158" w:history="1">
             <w:r>
               <w:rPr>
                 <w:rStyle w:val="Hyperlink"/>
@@ -3228,7 +3222,7 @@
                 <w:noProof/>
                 <w:webHidden/>
               </w:rPr>
-              <w:instrText xml:space="preserve"> PAGEREF _Toc208305618 \h </w:instrText>
+              <w:instrText xml:space="preserve"> PAGEREF _Toc212641158 \h </w:instrText>
             </w:r>
             <w:r>
               <w:rPr>
@@ -3248,7 +3242,7 @@
                 <w:noProof/>
                 <w:webHidden/>
               </w:rPr>
-              <w:t>24</w:t>
+              <w:t>25</w:t>
             </w:r>
             <w:r>
               <w:rPr>
@@ -3276,7 +3270,7 @@
               <w14:ligatures w14:val="standardContextual"/>
             </w:rPr>
           </w:pPr>
-          <w:hyperlink w:anchor="_Toc208305619" w:history="1">
+          <w:hyperlink w:anchor="_Toc212641159" w:history="1">
             <w:r>
               <w:rPr>
                 <w:rStyle w:val="Hyperlink"/>
@@ -3322,7 +3316,7 @@
                 <w:noProof/>
                 <w:webHidden/>
               </w:rPr>
-              <w:instrText xml:space="preserve"> PAGEREF _Toc208305619 \h </w:instrText>
+              <w:instrText xml:space="preserve"> PAGEREF _Toc212641159 \h </w:instrText>
             </w:r>
             <w:r>
               <w:rPr>
@@ -3342,7 +3336,7 @@
                 <w:noProof/>
                 <w:webHidden/>
               </w:rPr>
-              <w:t>24</w:t>
+              <w:t>25</w:t>
             </w:r>
             <w:r>
               <w:rPr>
@@ -3370,7 +3364,7 @@
               <w14:ligatures w14:val="standardContextual"/>
             </w:rPr>
           </w:pPr>
-          <w:hyperlink w:anchor="_Toc208305620" w:history="1">
+          <w:hyperlink w:anchor="_Toc212641160" w:history="1">
             <w:r>
               <w:rPr>
                 <w:rStyle w:val="Hyperlink"/>
@@ -3416,7 +3410,7 @@
                 <w:noProof/>
                 <w:webHidden/>
               </w:rPr>
-              <w:instrText xml:space="preserve"> PAGEREF _Toc208305620 \h </w:instrText>
+              <w:instrText xml:space="preserve"> PAGEREF _Toc212641160 \h </w:instrText>
             </w:r>
             <w:r>
               <w:rPr>
@@ -3436,7 +3430,7 @@
                 <w:noProof/>
                 <w:webHidden/>
               </w:rPr>
-              <w:t>24</w:t>
+              <w:t>25</w:t>
             </w:r>
             <w:r>
               <w:rPr>
@@ -3464,7 +3458,7 @@
               <w14:ligatures w14:val="standardContextual"/>
             </w:rPr>
           </w:pPr>
-          <w:hyperlink w:anchor="_Toc208305621" w:history="1">
+          <w:hyperlink w:anchor="_Toc212641161" w:history="1">
             <w:r>
               <w:rPr>
                 <w:rStyle w:val="Hyperlink"/>
@@ -3489,7 +3483,7 @@
                 <w:rStyle w:val="Hyperlink"/>
                 <w:noProof/>
               </w:rPr>
-              <w:t>Start the application when the system is loaded</w:t>
+              <w:t>Start the application with Task Scheduler</w:t>
             </w:r>
             <w:r>
               <w:rPr>
@@ -3510,7 +3504,7 @@
                 <w:noProof/>
                 <w:webHidden/>
               </w:rPr>
-              <w:instrText xml:space="preserve"> PAGEREF _Toc208305621 \h </w:instrText>
+              <w:instrText xml:space="preserve"> PAGEREF _Toc212641161 \h </w:instrText>
             </w:r>
             <w:r>
               <w:rPr>
@@ -3530,7 +3524,7 @@
                 <w:noProof/>
                 <w:webHidden/>
               </w:rPr>
-              <w:t>29</w:t>
+              <w:t>30</w:t>
             </w:r>
             <w:r>
               <w:rPr>
@@ -3558,7 +3552,7 @@
               <w14:ligatures w14:val="standardContextual"/>
             </w:rPr>
           </w:pPr>
-          <w:hyperlink w:anchor="_Toc208305622" w:history="1">
+          <w:hyperlink w:anchor="_Toc212641162" w:history="1">
             <w:r>
               <w:rPr>
                 <w:rStyle w:val="Hyperlink"/>
@@ -3604,7 +3598,7 @@
                 <w:noProof/>
                 <w:webHidden/>
               </w:rPr>
-              <w:instrText xml:space="preserve"> PAGEREF _Toc208305622 \h </w:instrText>
+              <w:instrText xml:space="preserve"> PAGEREF _Toc212641162 \h </w:instrText>
             </w:r>
             <w:r>
               <w:rPr>
@@ -3624,7 +3618,7 @@
                 <w:noProof/>
                 <w:webHidden/>
               </w:rPr>
-              <w:t>32</w:t>
+              <w:t>33</w:t>
             </w:r>
             <w:r>
               <w:rPr>
@@ -3652,7 +3646,7 @@
               <w14:ligatures w14:val="standardContextual"/>
             </w:rPr>
           </w:pPr>
-          <w:hyperlink w:anchor="_Toc208305623" w:history="1">
+          <w:hyperlink w:anchor="_Toc212641163" w:history="1">
             <w:r>
               <w:rPr>
                 <w:rStyle w:val="Hyperlink"/>
@@ -3698,7 +3692,7 @@
                 <w:noProof/>
                 <w:webHidden/>
               </w:rPr>
-              <w:instrText xml:space="preserve"> PAGEREF _Toc208305623 \h </w:instrText>
+              <w:instrText xml:space="preserve"> PAGEREF _Toc212641163 \h </w:instrText>
             </w:r>
             <w:r>
               <w:rPr>
@@ -3718,7 +3712,7 @@
                 <w:noProof/>
                 <w:webHidden/>
               </w:rPr>
-              <w:t>33</w:t>
+              <w:t>34</w:t>
             </w:r>
             <w:r>
               <w:rPr>
@@ -3746,7 +3740,7 @@
               <w14:ligatures w14:val="standardContextual"/>
             </w:rPr>
           </w:pPr>
-          <w:hyperlink w:anchor="_Toc208305624" w:history="1">
+          <w:hyperlink w:anchor="_Toc212641164" w:history="1">
             <w:r>
               <w:rPr>
                 <w:rStyle w:val="Hyperlink"/>
@@ -3792,7 +3786,7 @@
                 <w:noProof/>
                 <w:webHidden/>
               </w:rPr>
-              <w:instrText xml:space="preserve"> PAGEREF _Toc208305624 \h </w:instrText>
+              <w:instrText xml:space="preserve"> PAGEREF _Toc212641164 \h </w:instrText>
             </w:r>
             <w:r>
               <w:rPr>
@@ -3812,7 +3806,7 @@
                 <w:noProof/>
                 <w:webHidden/>
               </w:rPr>
-              <w:t>35</w:t>
+              <w:t>36</w:t>
             </w:r>
             <w:r>
               <w:rPr>
@@ -3840,7 +3834,7 @@
               <w14:ligatures w14:val="standardContextual"/>
             </w:rPr>
           </w:pPr>
-          <w:hyperlink w:anchor="_Toc208305625" w:history="1">
+          <w:hyperlink w:anchor="_Toc212641165" w:history="1">
             <w:r>
               <w:rPr>
                 <w:rStyle w:val="Hyperlink"/>
@@ -3886,7 +3880,7 @@
                 <w:noProof/>
                 <w:webHidden/>
               </w:rPr>
-              <w:instrText xml:space="preserve"> PAGEREF _Toc208305625 \h </w:instrText>
+              <w:instrText xml:space="preserve"> PAGEREF _Toc212641165 \h </w:instrText>
             </w:r>
             <w:r>
               <w:rPr>
@@ -3906,7 +3900,7 @@
                 <w:noProof/>
                 <w:webHidden/>
               </w:rPr>
-              <w:t>39</w:t>
+              <w:t>40</w:t>
             </w:r>
             <w:r>
               <w:rPr>
@@ -3959,7 +3953,7 @@
       <w:pPr>
         <w:pStyle w:val="Heading1"/>
       </w:pPr>
-      <w:bookmarkStart w:id="0" w:name="_Toc208305599"/>
+      <w:bookmarkStart w:id="0" w:name="_Toc212641139"/>
       <w:r>
         <w:lastRenderedPageBreak/>
         <w:t>EULA</w:t>
@@ -4047,7 +4041,7 @@
           <v:shape id="_x0000_i1025" type="#_x0000_t75" style="width:77.25pt;height:49.5pt" o:ole="">
             <v:imagedata r:id="rId7" o:title=""/>
           </v:shape>
-          <o:OLEObject Type="Embed" ProgID="Package" ShapeID="_x0000_i1025" DrawAspect="Icon" ObjectID="_1823241484" r:id="rId8"/>
+          <o:OLEObject Type="Embed" ProgID="Package" ShapeID="_x0000_i1025" DrawAspect="Icon" ObjectID="_1823253881" r:id="rId8"/>
         </w:object>
       </w:r>
     </w:p>
@@ -4075,7 +4069,7 @@
       <w:pPr>
         <w:pStyle w:val="Heading1"/>
       </w:pPr>
-      <w:bookmarkStart w:id="1" w:name="_Toc208305600"/>
+      <w:bookmarkStart w:id="1" w:name="_Toc212641140"/>
       <w:r>
         <w:t>Overview</w:t>
       </w:r>
@@ -4237,7 +4231,7 @@
       <w:pPr>
         <w:pStyle w:val="Heading2"/>
       </w:pPr>
-      <w:bookmarkStart w:id="2" w:name="_Toc208305601"/>
+      <w:bookmarkStart w:id="2" w:name="_Toc212641141"/>
       <w:r>
         <w:lastRenderedPageBreak/>
         <w:t>Availability</w:t>
@@ -4266,7 +4260,7 @@
       <w:pPr>
         <w:pStyle w:val="Heading2"/>
       </w:pPr>
-      <w:bookmarkStart w:id="3" w:name="_Toc208305602"/>
+      <w:bookmarkStart w:id="3" w:name="_Toc212641142"/>
       <w:r>
         <w:t>Architecture</w:t>
       </w:r>
@@ -6411,7 +6405,7 @@
       <w:pPr>
         <w:pStyle w:val="Heading2"/>
       </w:pPr>
-      <w:bookmarkStart w:id="4" w:name="_Toc208305603"/>
+      <w:bookmarkStart w:id="4" w:name="_Toc212641143"/>
       <w:r>
         <w:lastRenderedPageBreak/>
         <w:t>Pre-requisites</w:t>
@@ -6533,7 +6527,7 @@
       <w:pPr>
         <w:pStyle w:val="Heading2"/>
       </w:pPr>
-      <w:bookmarkStart w:id="5" w:name="_Toc208305604"/>
+      <w:bookmarkStart w:id="5" w:name="_Toc212641144"/>
       <w:r>
         <w:t>Installation</w:t>
       </w:r>
@@ -6619,7 +6613,7 @@
       <w:r>
         <w:br w:type="page"/>
       </w:r>
-      <w:bookmarkStart w:id="6" w:name="_Toc208305605"/>
+      <w:bookmarkStart w:id="6" w:name="_Toc212641145"/>
       <w:r>
         <w:lastRenderedPageBreak/>
         <w:t>Graphical User Interface</w:t>
@@ -8029,7 +8023,7 @@
       <w:r>
         <w:br w:type="page"/>
       </w:r>
-      <w:bookmarkStart w:id="7" w:name="_Toc208305606"/>
+      <w:bookmarkStart w:id="7" w:name="_Toc212641146"/>
       <w:r>
         <w:lastRenderedPageBreak/>
         <w:t>Setup</w:t>
@@ -8044,7 +8038,7 @@
           <w:numId w:val="5"/>
         </w:numPr>
       </w:pPr>
-      <w:bookmarkStart w:id="8" w:name="_Toc208305607"/>
+      <w:bookmarkStart w:id="8" w:name="_Toc212641147"/>
       <w:r>
         <w:t xml:space="preserve">Configuration </w:t>
       </w:r>
@@ -8104,7 +8098,7 @@
           <w:numId w:val="5"/>
         </w:numPr>
       </w:pPr>
-      <w:bookmarkStart w:id="9" w:name="_Toc208305608"/>
+      <w:bookmarkStart w:id="9" w:name="_Toc212641148"/>
       <w:r>
         <w:t>Connection configuration</w:t>
       </w:r>
@@ -8293,7 +8287,7 @@
         <w:pStyle w:val="Heading2"/>
       </w:pPr>
       <w:bookmarkStart w:id="10" w:name="_URL_Format"/>
-      <w:bookmarkStart w:id="11" w:name="_Toc208305609"/>
+      <w:bookmarkStart w:id="11" w:name="_Toc212641149"/>
       <w:bookmarkEnd w:id="10"/>
       <w:r>
         <w:t>Send protocol</w:t>
@@ -8378,7 +8372,7 @@
       <w:pPr>
         <w:pStyle w:val="Heading3"/>
       </w:pPr>
-      <w:bookmarkStart w:id="12" w:name="_Toc208305610"/>
+      <w:bookmarkStart w:id="12" w:name="_Toc212641150"/>
       <w:proofErr w:type="spellStart"/>
       <w:r>
         <w:t>KeyInjection</w:t>
@@ -8424,7 +8418,7 @@
       <w:pPr>
         <w:pStyle w:val="Heading3"/>
       </w:pPr>
-      <w:bookmarkStart w:id="13" w:name="_Toc208305611"/>
+      <w:bookmarkStart w:id="13" w:name="_Toc212641151"/>
       <w:r>
         <w:t>CLIPBOARDPASTE</w:t>
       </w:r>
@@ -8507,7 +8501,7 @@
       <w:pPr>
         <w:pStyle w:val="Heading3"/>
       </w:pPr>
-      <w:bookmarkStart w:id="14" w:name="_Toc208305612"/>
+      <w:bookmarkStart w:id="14" w:name="_Toc212641152"/>
       <w:r>
         <w:lastRenderedPageBreak/>
         <w:t>Target Window</w:t>
@@ -8716,7 +8710,7 @@
           <w:szCs w:val="26"/>
         </w:rPr>
       </w:pPr>
-      <w:bookmarkStart w:id="15" w:name="_Toc208305613"/>
+      <w:bookmarkStart w:id="15" w:name="_Toc212641153"/>
       <w:r>
         <w:lastRenderedPageBreak/>
         <w:t>MQTT</w:t>
@@ -8961,7 +8955,7 @@
       <w:pPr>
         <w:pStyle w:val="Heading2"/>
       </w:pPr>
-      <w:bookmarkStart w:id="16" w:name="_Toc208305614"/>
+      <w:bookmarkStart w:id="16" w:name="_Toc212641154"/>
       <w:r>
         <w:lastRenderedPageBreak/>
         <w:t>MQTT messaging.</w:t>
@@ -8977,7 +8971,7 @@
           <w:numId w:val="7"/>
         </w:numPr>
       </w:pPr>
-      <w:bookmarkStart w:id="17" w:name="_Toc208305615"/>
+      <w:bookmarkStart w:id="17" w:name="_Toc212641155"/>
       <w:r>
         <w:t xml:space="preserve">Receiving </w:t>
       </w:r>
@@ -9017,7 +9011,7 @@
       <w:pPr>
         <w:pStyle w:val="Heading3"/>
       </w:pPr>
-      <w:bookmarkStart w:id="18" w:name="_Toc208305616"/>
+      <w:bookmarkStart w:id="18" w:name="_Toc212641156"/>
       <w:r>
         <w:t>Controlling the FXP20</w:t>
       </w:r>
@@ -9203,7 +9197,7 @@
       <w:pPr>
         <w:pStyle w:val="Heading1"/>
       </w:pPr>
-      <w:bookmarkStart w:id="19" w:name="_Toc208305617"/>
+      <w:bookmarkStart w:id="19" w:name="_Toc212641157"/>
       <w:r>
         <w:lastRenderedPageBreak/>
         <w:t>Config.xml file</w:t>
@@ -9954,6 +9948,89 @@
             <w:tcW w:w="3565" w:type="dxa"/>
           </w:tcPr>
           <w:p>
+            <w:proofErr w:type="spellStart"/>
+            <w:r>
+              <w:t>MQTTReconnectAutomatically</w:t>
+            </w:r>
+            <w:proofErr w:type="spellEnd"/>
+          </w:p>
+        </w:tc>
+        <w:tc>
+          <w:tcPr>
+            <w:tcW w:w="1527" w:type="dxa"/>
+          </w:tcPr>
+          <w:p>
+            <w:r>
+              <w:t>Boolean</w:t>
+            </w:r>
+          </w:p>
+        </w:tc>
+        <w:tc>
+          <w:tcPr>
+            <w:tcW w:w="2950" w:type="dxa"/>
+          </w:tcPr>
+          <w:p>
+            <w:pPr>
+              <w:pStyle w:val="ListParagraph"/>
+              <w:numPr>
+                <w:ilvl w:val="0"/>
+                <w:numId w:val="15"/>
+              </w:numPr>
+              <w:ind w:left="171" w:hanging="171"/>
+            </w:pPr>
+            <w:r>
+              <w:t>true</w:t>
+            </w:r>
+          </w:p>
+          <w:p>
+            <w:pPr>
+              <w:pStyle w:val="ListParagraph"/>
+              <w:numPr>
+                <w:ilvl w:val="0"/>
+                <w:numId w:val="15"/>
+              </w:numPr>
+              <w:ind w:left="171" w:hanging="171"/>
+            </w:pPr>
+            <w:r>
+              <w:t>false</w:t>
+            </w:r>
+          </w:p>
+        </w:tc>
+        <w:tc>
+          <w:tcPr>
+            <w:tcW w:w="3547" w:type="dxa"/>
+          </w:tcPr>
+          <w:p>
+            <w:r>
+              <w:t xml:space="preserve">Auto reconnect to the </w:t>
+            </w:r>
+            <w:proofErr w:type="spellStart"/>
+            <w:r>
+              <w:t>MQTTBroker</w:t>
+            </w:r>
+            <w:proofErr w:type="spellEnd"/>
+            <w:r>
+              <w:t xml:space="preserve"> if it was disconnected or not available.</w:t>
+            </w:r>
+          </w:p>
+          <w:p>
+            <w:r>
+              <w:t>The app will wait for 5s before retrying to connect if the reader is unavailable.</w:t>
+            </w:r>
+          </w:p>
+          <w:p>
+            <w:r>
+              <w:t>Changing the protocol will stop the process.</w:t>
+            </w:r>
+          </w:p>
+        </w:tc>
+      </w:tr>
+      <w:tr>
+        <w:tc>
+          <w:tcPr>
+            <w:tcW w:w="3565" w:type="dxa"/>
+          </w:tcPr>
+          <w:p>
             <w:r>
               <w:t>Protocol</w:t>
             </w:r>
@@ -10174,6 +10251,7 @@
               <w:t>This will work only if a reader is found at the specified port and is available for connexion.</w:t>
             </w:r>
           </w:p>
+          <w:p/>
         </w:tc>
       </w:tr>
       <w:tr>
@@ -10184,6 +10262,7 @@
           <w:p>
             <w:proofErr w:type="spellStart"/>
             <w:r>
+              <w:lastRenderedPageBreak/>
               <w:t>AutoStartReading</w:t>
             </w:r>
             <w:proofErr w:type="spellEnd"/>
@@ -10255,7 +10334,6 @@
           <w:p>
             <w:proofErr w:type="spellStart"/>
             <w:r>
-              <w:lastRenderedPageBreak/>
               <w:t>AutoReconnectReader</w:t>
             </w:r>
             <w:proofErr w:type="spellEnd"/>
@@ -10785,7 +10863,11 @@
           </w:p>
           <w:p>
             <w:r>
-              <w:t xml:space="preserve">But since the method is synchronized, normally each call should be placed in a call pipe </w:t>
+              <w:t xml:space="preserve">But since the method is synchronized, normally each call </w:t>
+            </w:r>
+            <w:r>
+              <w:lastRenderedPageBreak/>
+              <w:t xml:space="preserve">should be placed in a call pipe </w:t>
             </w:r>
             <w:proofErr w:type="gramStart"/>
             <w:r>
@@ -11184,7 +11266,11 @@
           </w:p>
           <w:p>
             <w:r>
-              <w:t>These composite elements are automatically created by the application when it is launched without a Config.xml file.</w:t>
+              <w:t xml:space="preserve">These composite elements are automatically created by the </w:t>
+            </w:r>
+            <w:r>
+              <w:lastRenderedPageBreak/>
+              <w:t>application when it is launched without a Config.xml file.</w:t>
             </w:r>
           </w:p>
           <w:p>
@@ -11202,6 +11288,7 @@
           <w:p>
             <w:proofErr w:type="spellStart"/>
             <w:r>
+              <w:lastRenderedPageBreak/>
               <w:t>antennaConfig</w:t>
             </w:r>
             <w:proofErr w:type="spellEnd"/>
@@ -11251,7 +11338,6 @@
           <w:p>
             <w:proofErr w:type="spellStart"/>
             <w:r>
-              <w:lastRenderedPageBreak/>
               <w:t>Antenna_ID</w:t>
             </w:r>
             <w:proofErr w:type="spellEnd"/>
@@ -12080,6 +12166,8 @@
               <w:t>Set the Inventory State behaviour of the tags.</w:t>
             </w:r>
           </w:p>
+          <w:p/>
+          <w:p/>
         </w:tc>
       </w:tr>
       <w:tr>
@@ -12093,6 +12181,7 @@
               <w:rPr>
                 <w:lang w:val="fr-FR"/>
               </w:rPr>
+              <w:lastRenderedPageBreak/>
               <w:t>PerformReadingWithGPIO</w:t>
             </w:r>
             <w:proofErr w:type="spellEnd"/>
@@ -12218,7 +12307,6 @@
               <w:rPr>
                 <w:lang w:val="en-US"/>
               </w:rPr>
-              <w:lastRenderedPageBreak/>
               <w:t>PerformReadingDuration</w:t>
             </w:r>
             <w:proofErr w:type="spellEnd"/>
@@ -12277,7 +12365,6 @@
               <w:rPr>
                 <w:lang w:val="fr-FR"/>
               </w:rPr>
-              <w:lastRenderedPageBreak/>
               <w:t>PerformReadingGPIOPort</w:t>
             </w:r>
             <w:proofErr w:type="spellEnd"/>
@@ -12586,10 +12673,25 @@
     <w:p/>
     <w:p>
       <w:pPr>
+        <w:rPr>
+          <w:rFonts w:asciiTheme="majorHAnsi" w:eastAsiaTheme="majorEastAsia" w:hAnsiTheme="majorHAnsi" w:cstheme="majorBidi"/>
+          <w:b/>
+          <w:color w:val="2E74B5" w:themeColor="accent1" w:themeShade="BF"/>
+          <w:sz w:val="32"/>
+          <w:szCs w:val="32"/>
+        </w:rPr>
+      </w:pPr>
+      <w:r>
+        <w:br w:type="page"/>
+      </w:r>
+    </w:p>
+    <w:p>
+      <w:pPr>
         <w:pStyle w:val="Heading1"/>
       </w:pPr>
-      <w:bookmarkStart w:id="20" w:name="_Toc208305618"/>
-      <w:r>
+      <w:bookmarkStart w:id="20" w:name="_Toc212641158"/>
+      <w:r>
+        <w:lastRenderedPageBreak/>
         <w:t>Appendix</w:t>
       </w:r>
       <w:bookmarkEnd w:id="20"/>
@@ -12602,7 +12704,7 @@
           <w:numId w:val="16"/>
         </w:numPr>
       </w:pPr>
-      <w:bookmarkStart w:id="21" w:name="_Toc208305619"/>
+      <w:bookmarkStart w:id="21" w:name="_Toc212641159"/>
       <w:r>
         <w:t>Auto-Start application</w:t>
       </w:r>
@@ -12621,7 +12723,7 @@
           <w:numId w:val="24"/>
         </w:numPr>
       </w:pPr>
-      <w:bookmarkStart w:id="22" w:name="_Toc208305620"/>
+      <w:bookmarkStart w:id="22" w:name="_Toc212641160"/>
       <w:r>
         <w:t>Start the application when the user logs on</w:t>
       </w:r>
@@ -12693,7 +12795,6 @@
         <w:rPr>
           <w:noProof/>
         </w:rPr>
-        <w:lastRenderedPageBreak/>
         <w:drawing>
           <wp:inline distT="0" distB="0" distL="0" distR="0" wp14:anchorId="6E63DA7A" wp14:editId="1CA984C4">
             <wp:extent cx="5731510" cy="3466465"/>
@@ -12749,6 +12850,7 @@
         <w:rPr>
           <w:noProof/>
         </w:rPr>
+        <w:lastRenderedPageBreak/>
         <w:drawing>
           <wp:inline distT="0" distB="0" distL="0" distR="0" wp14:anchorId="4ED869DC" wp14:editId="62F2D56D">
             <wp:extent cx="5731510" cy="3466465"/>
@@ -13214,15 +13316,15 @@
       <w:pPr>
         <w:pStyle w:val="Heading3"/>
       </w:pPr>
-      <w:bookmarkStart w:id="23" w:name="_Toc208305621"/>
+      <w:bookmarkStart w:id="23" w:name="_Toc212641161"/>
       <w:r>
         <w:lastRenderedPageBreak/>
         <w:t xml:space="preserve">Start the application </w:t>
       </w:r>
+      <w:r>
+        <w:t>with Task Scheduler</w:t>
+      </w:r>
       <w:bookmarkEnd w:id="23"/>
-      <w:r>
-        <w:t>with Task Scheduler</w:t>
-      </w:r>
     </w:p>
     <w:p>
       <w:r>
@@ -13630,7 +13732,7 @@
       <w:pPr>
         <w:pStyle w:val="Heading3"/>
       </w:pPr>
-      <w:bookmarkStart w:id="24" w:name="_Toc208305622"/>
+      <w:bookmarkStart w:id="24" w:name="_Toc212641162"/>
       <w:r>
         <w:t>Manage the FXP20 Startup parameters</w:t>
       </w:r>
@@ -13793,7 +13895,7 @@
           <w:numId w:val="16"/>
         </w:numPr>
       </w:pPr>
-      <w:bookmarkStart w:id="25" w:name="_Toc208305623"/>
+      <w:bookmarkStart w:id="25" w:name="_Toc212641163"/>
       <w:r>
         <w:t>ASCII Printable Characters</w:t>
       </w:r>
@@ -15933,7 +16035,7 @@
       <w:pPr>
         <w:pStyle w:val="Heading2"/>
       </w:pPr>
-      <w:bookmarkStart w:id="26" w:name="_Toc208305624"/>
+      <w:bookmarkStart w:id="26" w:name="_Toc212641164"/>
       <w:r>
         <w:t>Transmit Power Index</w:t>
       </w:r>
@@ -21463,7 +21565,7 @@
       <w:pPr>
         <w:pStyle w:val="Heading2"/>
       </w:pPr>
-      <w:bookmarkStart w:id="27" w:name="_Toc208305625"/>
+      <w:bookmarkStart w:id="27" w:name="_Toc212641165"/>
       <w:proofErr w:type="spellStart"/>
       <w:r>
         <w:lastRenderedPageBreak/>
@@ -22137,7 +22239,7 @@
           <v:shape id="_x0000_i1026" type="#_x0000_t75" style="width:76.5pt;height:49.5pt" o:ole="">
             <v:imagedata r:id="rId47" o:title=""/>
           </v:shape>
-          <o:OLEObject Type="Embed" ProgID="Package" ShapeID="_x0000_i1026" DrawAspect="Icon" ObjectID="_1823241485" r:id="rId48"/>
+          <o:OLEObject Type="Embed" ProgID="Package" ShapeID="_x0000_i1026" DrawAspect="Icon" ObjectID="_1823253882" r:id="rId48"/>
         </w:object>
       </w:r>
     </w:p>
@@ -22265,7 +22367,7 @@
           <v:shape id="_x0000_i1027" type="#_x0000_t75" style="width:76.5pt;height:49.5pt" o:ole="">
             <v:imagedata r:id="rId50" o:title=""/>
           </v:shape>
-          <o:OLEObject Type="Embed" ProgID="Package" ShapeID="_x0000_i1027" DrawAspect="Icon" ObjectID="_1823241486" r:id="rId51"/>
+          <o:OLEObject Type="Embed" ProgID="Package" ShapeID="_x0000_i1027" DrawAspect="Icon" ObjectID="_1823253883" r:id="rId51"/>
         </w:object>
       </w:r>
     </w:p>

</xml_diff>